<commit_message>
Phone/Email portion of the signature block
</commit_message>
<xml_diff>
--- a/Filings/Discovery/InitialDisclosure/Plaintiffs_Initial_Disclosures.docx
+++ b/Filings/Discovery/InitialDisclosure/Plaintiffs_Initial_Disclosures.docx
@@ -1287,6 +1287,42 @@
       <w:pPr>
         <w:spacing w:after="0" w:before="0" w:line="240" w:lineRule="auto"/>
       </w:pPr>
+      <w:r>
+        <w:rPr>
+          <w:b w:val="0"/>
+          <w:i w:val="0"/>
+        </w:rPr>
+        <w:t>17756 George Moran Dr., Eden Prairie, MN 55347</w:t>
+      </w:r>
+    </w:p>
+    <w:p>
+      <w:pPr>
+        <w:spacing w:after="0" w:before="0" w:line="240" w:lineRule="auto"/>
+      </w:pPr>
+      <w:r>
+        <w:rPr>
+          <w:b w:val="0"/>
+          <w:i w:val="0"/>
+        </w:rPr>
+        <w:t>Telephone: 763-843-2859</w:t>
+      </w:r>
+    </w:p>
+    <w:p>
+      <w:pPr>
+        <w:spacing w:after="0" w:before="0" w:line="240" w:lineRule="auto"/>
+      </w:pPr>
+      <w:r>
+        <w:rPr>
+          <w:b w:val="0"/>
+          <w:i w:val="0"/>
+        </w:rPr>
+        <w:t>Email: bill_y_lu@yahoo.com</w:t>
+      </w:r>
+    </w:p>
+    <w:p>
+      <w:pPr>
+        <w:spacing w:after="0" w:before="0" w:line="240" w:lineRule="auto"/>
+      </w:pPr>
     </w:p>
     <w:p>
       <w:pPr>
@@ -1333,7 +1369,19 @@
           <w:b w:val="0"/>
           <w:i w:val="0"/>
         </w:rPr>
-        <w:t>Telephone: ______________   Email: ______________</w:t>
+        <w:t>Telephone: 763-843-2860</w:t>
+      </w:r>
+    </w:p>
+    <w:p>
+      <w:pPr>
+        <w:spacing w:after="0" w:before="0" w:line="240" w:lineRule="auto"/>
+      </w:pPr>
+      <w:r>
+        <w:rPr>
+          <w:b w:val="0"/>
+          <w:i w:val="0"/>
+        </w:rPr>
+        <w:t>Email: jie_h_hu@yahoo.com</w:t>
       </w:r>
     </w:p>
     <w:p>
@@ -1363,7 +1411,7 @@
           <w:b w:val="0"/>
           <w:i w:val="0"/>
         </w:rPr>
-        <w:t>The undersigned certifies that on ______________, 2026, a true and correct copy of Plaintiffs’ Initial Disclosures was served upon Defendant, through its attorneys of record, by ______________ [e-service through the Minnesota eFS system / email / U.S. Mail], in accordance with Minn. R. Civ. P. 5. These disclosures are served, not filed, in accordance with Minn. R. Civ. P. 5.04.</w:t>
+        <w:t>The undersigned certifies that on ______________, 2026, a true and correct copy of Plaintiffs’ Initial Disclosures was served upon Defendant, through its attorneys of record, by ______________ [e-service through the Minnesota eFS system / email / U.S. Mail], in accordance with Minn. R. Civ. P. 5. These disclosures are served, not filed, in accordance with Minn. R. Civ. P. 5.04(b).</w:t>
       </w:r>
     </w:p>
     <w:p>

</xml_diff>